<commit_message>
saving the new analysor jupyters and changes to the code so far, the logic is mainly working correctly but the project lacks unity across the files
</commit_message>
<xml_diff>
--- a/Documentation/Logbook.docx
+++ b/Documentation/Logbook.docx
@@ -2491,6 +2491,62 @@
           <w:b/>
         </w:rPr>
         <w:t xml:space="preserve">Extracting the hidden states from the frozen models didn’t need as much computational power as training a simple probe, for my next actions I will further optimise the code for probing and the extraction, my main concern is the integrity of the data, I want to make sure the code I’m developing cleverly maps everything together and keeps track of inputs from the beginning of cleaning the dataset to when we are  representing the layer wise probing system.  I will also work on the project files and keep the root clean. </w:t>
+      </w:r>
+    </w:p>
+    <w:p>
+      <w:pPr>
+        <w:spacing w:after="331"/>
+      </w:pPr>
+      <w:r>
+        <w:rPr>
+          <w:rFonts w:ascii="Times" w:hAnsi="Times" w:cs="Times"/>
+          <w:sz w:val="24"/>
+          <w:sz-cs w:val="24"/>
+          <w:b/>
+        </w:rPr>
+        <w:t xml:space="preserve">30/8/2026</w:t>
+      </w:r>
+    </w:p>
+    <w:p>
+      <w:pPr>
+        <w:spacing w:after="331"/>
+      </w:pPr>
+      <w:r>
+        <w:rPr>
+          <w:rFonts w:ascii="Times" w:hAnsi="Times" w:cs="Times"/>
+          <w:sz w:val="24"/>
+          <w:sz-cs w:val="24"/>
+          <w:b/>
+        </w:rPr>
+        <w:t xml:space="preserve">I have made significant changes to my code and have several backups, linking the dataset cleaning -&gt; extracting the hidden states -&gt;  training probes on the hidden states (labels remain the target) -&gt; validating on the datasets -&gt;  compare the layers of the same model -&gt; compare the performance of different models. But what I lack is a unified class which performs all this with a model name and dataset. I am also using advanced AI tools to better structure the workflow of my project.</w:t>
+      </w:r>
+    </w:p>
+    <w:p>
+      <w:pPr>
+        <w:spacing w:after="331"/>
+      </w:pPr>
+      <w:r>
+        <w:rPr>
+          <w:rFonts w:ascii="Times" w:hAnsi="Times" w:cs="Times"/>
+          <w:sz w:val="24"/>
+          <w:sz-cs w:val="24"/>
+          <w:b/>
+        </w:rPr>
+        <w:t xml:space="preserve">-</w:t>
+      </w:r>
+    </w:p>
+    <w:p>
+      <w:pPr>
+        <w:spacing w:after="331"/>
+      </w:pPr>
+      <w:r>
+        <w:rPr>
+          <w:rFonts w:ascii="Times" w:hAnsi="Times" w:cs="Times"/>
+          <w:sz w:val="24"/>
+          <w:sz-cs w:val="24"/>
+          <w:b/>
+        </w:rPr>
+        <w:t xml:space="preserve">-</w:t>
       </w:r>
     </w:p>
     <w:p>

</xml_diff>

<commit_message>
Changed the README.md file, Updated logbook, Improvments in other areas of the project
</commit_message>
<xml_diff>
--- a/Documentation/Logbook.docx
+++ b/Documentation/Logbook.docx
@@ -2532,21 +2532,21 @@
           <w:sz-cs w:val="24"/>
           <w:b/>
         </w:rPr>
-        <w:t xml:space="preserve">-</w:t>
-      </w:r>
-    </w:p>
-    <w:p>
-      <w:pPr>
-        <w:spacing w:after="331"/>
-      </w:pPr>
-      <w:r>
-        <w:rPr>
-          <w:rFonts w:ascii="Times" w:hAnsi="Times" w:cs="Times"/>
-          <w:sz w:val="24"/>
-          <w:sz-cs w:val="24"/>
-          <w:b/>
-        </w:rPr>
-        <w:t xml:space="preserve">-</w:t>
+        <w:t xml:space="preserve">Clean and organised project root,  readme file, comments and documentation. with a version control I can easily trace back the files that are accidentally lost, improved the performance of the analysers for a more robust error check during the runtime of my project before merging it as an application.  </w:t>
+      </w:r>
+    </w:p>
+    <w:p>
+      <w:pPr>
+        <w:spacing w:after="331"/>
+      </w:pPr>
+      <w:r>
+        <w:rPr>
+          <w:rFonts w:ascii="Times" w:hAnsi="Times" w:cs="Times"/>
+          <w:sz w:val="24"/>
+          <w:sz-cs w:val="24"/>
+          <w:b/>
+        </w:rPr>
+        <w:t xml:space="preserve">There are many points to improve, make the extraction code and generalise (*(any) -&gt;(to) *(any)) as possible and make the probe code as fast as possible (after these I can move on to merging them as one python class and application). Next I have to consider how to use the promised QWEN models, different models, different interpretability/explainability methods, different hyper parameters per run. It feels like a never ending fight and you only have an old Swiss pocket knife. The improvement list is not finished either because comparing and cross validating all  the results is just a part of the project and a hunch to find a pattern. There has been a promising progress with the extraction process, however they are all bundled behind a question mark which stains the integrity of the data in the project pipeline. Currently many file saving attempts are in place to stop this, but from deep analysis it can be observed they have been in vain. The long term solution is using OOP designs with classes and inheritance. Even though we are technically not creating an application here, but the methodology will help the project pipeline and possibly allows me to turn this project into a simple interface for probing language models. </w:t>
       </w:r>
     </w:p>
     <w:p>

</xml_diff>

<commit_message>
Improved the code for probes and added atomic writes and pre-run checks for existing probes. made file for demonstrating my pipeline, improvments in other areas.
</commit_message>
<xml_diff>
--- a/Documentation/Logbook.docx
+++ b/Documentation/Logbook.docx
@@ -2547,6 +2547,132 @@
           <w:b/>
         </w:rPr>
         <w:t xml:space="preserve">There are many points to improve, make the extraction code and generalise (*(any) -&gt;(to) *(any)) as possible and make the probe code as fast as possible (after these I can move on to merging them as one python class and application). Next I have to consider how to use the promised QWEN models, different models, different interpretability/explainability methods, different hyper parameters per run. It feels like a never ending fight and you only have an old Swiss pocket knife. The improvement list is not finished either because comparing and cross validating all  the results is just a part of the project and a hunch to find a pattern. There has been a promising progress with the extraction process, however they are all bundled behind a question mark which stains the integrity of the data in the project pipeline. Currently many file saving attempts are in place to stop this, but from deep analysis it can be observed they have been in vain. The long term solution is using OOP designs with classes and inheritance. Even though we are technically not creating an application here, but the methodology will help the project pipeline and possibly allows me to turn this project into a simple interface for probing language models. </w:t>
+      </w:r>
+    </w:p>
+    <w:p>
+      <w:pPr>
+        <w:spacing w:after="331"/>
+      </w:pPr>
+      <w:r>
+        <w:rPr>
+          <w:rFonts w:ascii="Times" w:hAnsi="Times" w:cs="Times"/>
+          <w:sz w:val="24"/>
+          <w:sz-cs w:val="24"/>
+          <w:b/>
+        </w:rPr>
+        <w:t xml:space="preserve"/>
+      </w:r>
+    </w:p>
+    <w:p>
+      <w:pPr>
+        <w:spacing w:after="331"/>
+      </w:pPr>
+      <w:r>
+        <w:rPr>
+          <w:rFonts w:ascii="Times" w:hAnsi="Times" w:cs="Times"/>
+          <w:sz w:val="24"/>
+          <w:sz-cs w:val="24"/>
+          <w:b/>
+        </w:rPr>
+        <w:t xml:space="preserve">1/9/2026</w:t>
+      </w:r>
+    </w:p>
+    <w:p>
+      <w:pPr>
+        <w:spacing w:after="331"/>
+      </w:pPr>
+      <w:r>
+        <w:rPr>
+          <w:rFonts w:ascii="Times" w:hAnsi="Times" w:cs="Times"/>
+          <w:sz w:val="24"/>
+          <w:sz-cs w:val="24"/>
+          <w:b/>
+        </w:rPr>
+        <w:t xml:space="preserve">I have had noticeable progress with refining my code, I am stuck with a slow apple silicon cpu without a way to take advantage of my gpu, therefore I worked more on making my code clean as well as crash and bug free. I haven’t spent much time on documentation as I am falling behind my delivery schedule, due to slow progress and insufficient result to convey meaning from them. </w:t>
+      </w:r>
+    </w:p>
+    <w:p>
+      <w:pPr>
+        <w:spacing w:after="331"/>
+      </w:pPr>
+      <w:r>
+        <w:rPr>
+          <w:rFonts w:ascii="Times" w:hAnsi="Times" w:cs="Times"/>
+          <w:sz w:val="24"/>
+          <w:sz-cs w:val="24"/>
+          <w:b/>
+        </w:rPr>
+        <w:t xml:space="preserve">I have contagious GitHub commits and atomic writes and processing of model’s hidden states as well as probing each layer of the models. Even if my kernel crashes during a fit for a probe, the atomic file writer will save the state of the probe and can progress upon it. This will significantly improve the entire pipeline of my work, training different probes on the whole datasets, different models, repeats and varying hyper parameters needed to be recorded. </w:t>
+      </w:r>
+    </w:p>
+    <w:p>
+      <w:pPr>
+        <w:spacing w:after="331"/>
+      </w:pPr>
+      <w:r>
+        <w:rPr>
+          <w:rFonts w:ascii="Times" w:hAnsi="Times" w:cs="Times"/>
+          <w:sz w:val="24"/>
+          <w:sz-cs w:val="24"/>
+          <w:b/>
+        </w:rPr>
+        <w:t xml:space="preserve">I have made each section of the project I was working on as robust and generalised as possible, mainly for ease of use, since my computer is always running hidden state extraction and training and testing probes so it’s always slow and kernel crashes often, this new approach completely flattens the project with no failure. Moreover, to extend of this problem I am planning on creating a single python class with interface which will correctly execute my separated project files, via a neat interface capturing user’s needs. I hope this project could be found useful for someone else since it can work with a given dataset and a given model name on hugging face. It would ideally pre-process the dataset automatically (we just need the text column and the label) so if somebody decides to use my project, they aren’t asking where does emotion learning happens in LLMs like QWEN, they can ask how recoverable is my question from the answer and what layers are responsible for this ? </w:t>
+      </w:r>
+    </w:p>
+    <w:p>
+      <w:pPr>
+        <w:spacing w:after="331"/>
+      </w:pPr>
+      <w:r>
+        <w:rPr>
+          <w:rFonts w:ascii="Times" w:hAnsi="Times" w:cs="Times"/>
+          <w:sz w:val="24"/>
+          <w:sz-cs w:val="24"/>
+          <w:b/>
+        </w:rPr>
+        <w:t xml:space="preserve">2/9/2026</w:t>
+      </w:r>
+    </w:p>
+    <w:p>
+      <w:pPr>
+        <w:spacing w:after="331"/>
+      </w:pPr>
+      <w:r>
+        <w:rPr>
+          <w:rFonts w:ascii="Times" w:hAnsi="Times" w:cs="Times"/>
+          <w:sz w:val="24"/>
+          <w:sz-cs w:val="24"/>
+          <w:b/>
+        </w:rPr>
+        <w:t xml:space="preserve">-</w:t>
+      </w:r>
+    </w:p>
+    <w:p>
+      <w:pPr>
+        <w:spacing w:after="331"/>
+      </w:pPr>
+      <w:r>
+        <w:rPr>
+          <w:rFonts w:ascii="Times" w:hAnsi="Times" w:cs="Times"/>
+          <w:sz w:val="24"/>
+          <w:sz-cs w:val="24"/>
+          <w:b/>
+        </w:rPr>
+        <w:t xml:space="preserve">-</w:t>
+      </w:r>
+    </w:p>
+    <w:p>
+      <w:pPr>
+        <w:spacing w:after="331"/>
+      </w:pPr>
+      <w:r>
+        <w:rPr>
+          <w:rFonts w:ascii="Times" w:hAnsi="Times" w:cs="Times"/>
+          <w:sz w:val="24"/>
+          <w:sz-cs w:val="24"/>
+          <w:b/>
+        </w:rPr>
+        <w:t xml:space="preserve">-</w:t>
       </w:r>
     </w:p>
     <w:p>

</xml_diff>

<commit_message>
Updated the logbook, Made a readme.md file using the latest 2026 techiques, continue the probing of the models, deleted unecessary files and folders, cleaned project file and folder structure.
</commit_message>
<xml_diff>
--- a/Documentation/Logbook.docx
+++ b/Documentation/Logbook.docx
@@ -2644,7 +2644,63 @@
           <w:sz-cs w:val="24"/>
           <w:b/>
         </w:rPr>
-        <w:t xml:space="preserve">-</w:t>
+        <w:t xml:space="preserve">I have made noticeable changes to the code and overall have improved the speed and pipeline integrity of the code. I don’t have to worry about kernel crashes anymore, I have atomic file writes throughout my project, golden files only for saving the state of the code and will be deleted on full result completion (always only one per probe). </w:t>
+      </w:r>
+    </w:p>
+    <w:p>
+      <w:pPr>
+        <w:spacing w:after="331"/>
+      </w:pPr>
+      <w:r>
+        <w:rPr>
+          <w:rFonts w:ascii="Times" w:hAnsi="Times" w:cs="Times"/>
+          <w:sz w:val="24"/>
+          <w:sz-cs w:val="24"/>
+          <w:b/>
+        </w:rPr>
+        <w:t xml:space="preserve">I have made GitHub commits consistent so there would be other references for the timestamp of this project,  made analysers more robust and able to check the hidden states, project files and probe’s performance integrity.  Moreover, I have made the pipeline file I wanted and it can successfully meet user’s probing needs. However, running this file on large data or big probes would take a lot of time. </w:t>
+      </w:r>
+    </w:p>
+    <w:p>
+      <w:pPr>
+        <w:spacing w:after="331"/>
+      </w:pPr>
+      <w:r>
+        <w:rPr>
+          <w:rFonts w:ascii="Times" w:hAnsi="Times" w:cs="Times"/>
+          <w:sz w:val="24"/>
+          <w:sz-cs w:val="24"/>
+          <w:b/>
+        </w:rPr>
+        <w:t xml:space="preserve">Since my entire project is result centric, I wanted to have this pipeline file for demonstration purposes, maybe it can act as a smaller version of my goals and only demonstrate how we probe a model and provide a visual display of the lifecycle of the data. </w:t>
+      </w:r>
+    </w:p>
+    <w:p>
+      <w:pPr>
+        <w:spacing w:after="331"/>
+      </w:pPr>
+      <w:r>
+        <w:rPr>
+          <w:rFonts w:ascii="Times" w:hAnsi="Times" w:cs="Times"/>
+          <w:sz w:val="24"/>
+          <w:sz-cs w:val="24"/>
+          <w:b/>
+        </w:rPr>
+        <w:t xml:space="preserve">3/9/2026</w:t>
+      </w:r>
+    </w:p>
+    <w:p>
+      <w:pPr>
+        <w:spacing w:after="331"/>
+      </w:pPr>
+      <w:r>
+        <w:rPr>
+          <w:rFonts w:ascii="Times" w:hAnsi="Times" w:cs="Times"/>
+          <w:sz w:val="24"/>
+          <w:sz-cs w:val="24"/>
+          <w:b/>
+        </w:rPr>
+        <w:t xml:space="preserve">I have extracted the hidden states of almost half of the 25 selected model, but I haven’t finished probing the first model (BERT). The pipeline is mainly slow due to the fact we are using 4 different probes with different layer depth and complexity. From my previous experiment, I already know the best performance probes were with 1 and 2 hidden layers respectively. Wish I could resolve these ambiguities with my supervisor. I wouldn’t have ended up with trying to use 4 different probes to put them after each layer of each of the 25v models while thinking maybe I need one or two other datasets for better demonstration of the results. Yes it’s true that we can cross validate them with each other and extract meaning, but it’s more time consuming than that. </w:t>
       </w:r>
     </w:p>
     <w:p>

</xml_diff>

<commit_message>
logbook, readme, cleaned the dataset cleaning process, continue probing. saving changes for the up comming implementations
</commit_message>
<xml_diff>
--- a/Documentation/Logbook.docx
+++ b/Documentation/Logbook.docx
@@ -2714,6 +2714,48 @@
           <w:sz-cs w:val="24"/>
           <w:b/>
         </w:rPr>
+        <w:t xml:space="preserve">Currently, I’m trying to implement a single python class for executing my probing pipeline, I shall use this pipeline to add more explainability and interpretability methods. As if I’m writing a code for understanding the characteristics of any given model. (Which will be directly and relevantly limited to the datasets users provide besides mine)</w:t>
+      </w:r>
+    </w:p>
+    <w:p>
+      <w:pPr>
+        <w:spacing w:after="331"/>
+      </w:pPr>
+      <w:r>
+        <w:rPr>
+          <w:rFonts w:ascii="Times" w:hAnsi="Times" w:cs="Times"/>
+          <w:sz w:val="24"/>
+          <w:sz-cs w:val="24"/>
+          <w:b/>
+        </w:rPr>
+        <w:t xml:space="preserve">I have already implemented most of what I have promised in the specification, however due to slow progress on extraction / probing I have decided to refine my current code further.  For my next action plans, I’m looking for a proper cloud environment for expensive runs (bigger models), a spare laptop or PC for extracting and probing smaller models,  is there a way to take advantage of parallelism (=) and concurrency(-_-_-) with this project ? How to handle atomic cases ? </w:t>
+      </w:r>
+    </w:p>
+    <w:p>
+      <w:pPr>
+        <w:spacing w:after="331"/>
+      </w:pPr>
+      <w:r>
+        <w:rPr>
+          <w:rFonts w:ascii="Times" w:hAnsi="Times" w:cs="Times"/>
+          <w:sz w:val="24"/>
+          <w:sz-cs w:val="24"/>
+          <w:b/>
+        </w:rPr>
+        <w:t xml:space="preserve">3/9/2026</w:t>
+      </w:r>
+    </w:p>
+    <w:p>
+      <w:pPr>
+        <w:spacing w:after="331"/>
+      </w:pPr>
+      <w:r>
+        <w:rPr>
+          <w:rFonts w:ascii="Times" w:hAnsi="Times" w:cs="Times"/>
+          <w:sz w:val="24"/>
+          <w:sz-cs w:val="24"/>
+          <w:b/>
+        </w:rPr>
         <w:t xml:space="preserve">-</w:t>
       </w:r>
     </w:p>
@@ -2733,7 +2775,20 @@
     </w:p>
     <w:p>
       <w:pPr>
-        <w:jc w:val="center"/>
+        <w:spacing w:after="331"/>
+      </w:pPr>
+      <w:r>
+        <w:rPr>
+          <w:rFonts w:ascii="Times" w:hAnsi="Times" w:cs="Times"/>
+          <w:sz w:val="24"/>
+          <w:sz-cs w:val="24"/>
+          <w:b/>
+        </w:rPr>
+        <w:t xml:space="preserve">-</w:t>
+      </w:r>
+    </w:p>
+    <w:p>
+      <w:pPr>
         <w:spacing w:after="331"/>
       </w:pPr>
       <w:r>

</xml_diff>

<commit_message>
preparing for moving the code into new machiens, preparing prequisits, package wheels, model bolbs, code itself, extracted hidden states, probe results, documentation, demonstrations, plots, results, etc.. will heavily change for each new operating system we will have to work with, the key is adapting fast
</commit_message>
<xml_diff>
--- a/Documentation/Logbook.docx
+++ b/Documentation/Logbook.docx
@@ -2743,6 +2743,118 @@
           <w:b/>
         </w:rPr>
         <w:t xml:space="preserve">3/9/2026</w:t>
+      </w:r>
+    </w:p>
+    <w:p>
+      <w:pPr>
+        <w:spacing w:after="331"/>
+      </w:pPr>
+      <w:r>
+        <w:rPr>
+          <w:rFonts w:ascii="Times" w:hAnsi="Times" w:cs="Times"/>
+          <w:sz w:val="24"/>
+          <w:sz-cs w:val="24"/>
+          <w:b/>
+        </w:rPr>
+        <w:t xml:space="preserve">I have had significant progress with correcting the probing code explicitly, new documentation files, modifications to the rest of the code, plus changes in naming conviction. </w:t>
+      </w:r>
+    </w:p>
+    <w:p>
+      <w:pPr>
+        <w:spacing w:after="331"/>
+      </w:pPr>
+      <w:r>
+        <w:rPr>
+          <w:rFonts w:ascii="Times" w:hAnsi="Times" w:cs="Times"/>
+          <w:sz w:val="24"/>
+          <w:sz-cs w:val="24"/>
+          <w:b/>
+        </w:rPr>
+        <w:t xml:space="preserve">The probing code now can successfully save the probe’s state for a trial with a set of hyperparameters, I have gathered information and resources on how to move the code and explicitly the extraction and probing on two different machines, I have updated analyses code and probe code bundle logic, changed the name of the files for ease of typography and convenience in conviction. </w:t>
+      </w:r>
+    </w:p>
+    <w:p>
+      <w:pPr>
+        <w:spacing w:after="331"/>
+      </w:pPr>
+      <w:r>
+        <w:rPr>
+          <w:rFonts w:ascii="Times" w:hAnsi="Times" w:cs="Times"/>
+          <w:sz w:val="24"/>
+          <w:sz-cs w:val="24"/>
+          <w:b/>
+        </w:rPr>
+        <w:t xml:space="preserve">The code will be moved to different machines to split the load of the work on different cpus. The code is poorly documented and there are vague parts needed to be explained, the probing code should be sound proof similar to the extraction code (more trust worthy), although what I’m doing with probes isn’t fundamentally trustworthier than the extraction process, so it’s normal to have some vague areas and ambiguities relatively speaking to the correctness of the extraction and probing process. </w:t>
+      </w:r>
+    </w:p>
+    <w:p>
+      <w:pPr>
+        <w:spacing w:after="331"/>
+      </w:pPr>
+      <w:r>
+        <w:rPr>
+          <w:rFonts w:ascii="Times" w:hAnsi="Times" w:cs="Times"/>
+          <w:sz w:val="24"/>
+          <w:sz-cs w:val="24"/>
+          <w:b/>
+        </w:rPr>
+        <w:t xml:space="preserve">4/9/2026</w:t>
+      </w:r>
+    </w:p>
+    <w:p>
+      <w:pPr>
+        <w:spacing w:after="331"/>
+      </w:pPr>
+      <w:r>
+        <w:rPr>
+          <w:rFonts w:ascii="Times" w:hAnsi="Times" w:cs="Times"/>
+          <w:sz w:val="24"/>
+          <w:sz-cs w:val="24"/>
+          <w:b/>
+        </w:rPr>
+        <w:t xml:space="preserve">Progress with moving the code to new machines, new documentations / guidelines and steps needed to be taken for completion of the project’s code. Bigger dreams in the absence of my supervisor. There are many areas of the code that need improvement, currently the only sophisticatedly completed file in my project is extraction file, which was easy to get it work atomically with the frozen models. </w:t>
+      </w:r>
+    </w:p>
+    <w:p>
+      <w:pPr>
+        <w:spacing w:after="331"/>
+      </w:pPr>
+      <w:r>
+        <w:rPr>
+          <w:rFonts w:ascii="Times" w:hAnsi="Times" w:cs="Times"/>
+          <w:sz w:val="24"/>
+          <w:sz-cs w:val="24"/>
+          <w:b/>
+        </w:rPr>
+        <w:t xml:space="preserve">The core idea of what I’m doing is manual concurrency and parallelism,  for speeding up the pipeline of the project, next I will fall back to generalising the codes a bit further, so that it would look closer to a python library, maybe I could establish it as one in future. To be able to probe any model using any dataset with manual configuration for probes is genuinely a useful library, if it had existed, it would have made my work a whole lot easier. </w:t>
+      </w:r>
+    </w:p>
+    <w:p>
+      <w:pPr>
+        <w:spacing w:after="331"/>
+      </w:pPr>
+      <w:r>
+        <w:rPr>
+          <w:rFonts w:ascii="Times" w:hAnsi="Times" w:cs="Times"/>
+          <w:sz w:val="24"/>
+          <w:sz-cs w:val="24"/>
+          <w:b/>
+        </w:rPr>
+        <w:t xml:space="preserve">Thinking about actually implementing concurrency and parallelism with collision checks sounds like the biggest hassle that can come into my mind right now, considering the scope of my project and the type of machines and cpus I’m working with this sounds more like a dream to achieve.</w:t>
+      </w:r>
+    </w:p>
+    <w:p>
+      <w:pPr>
+        <w:spacing w:after="331"/>
+      </w:pPr>
+      <w:r>
+        <w:rPr>
+          <w:rFonts w:ascii="Times" w:hAnsi="Times" w:cs="Times"/>
+          <w:sz w:val="24"/>
+          <w:sz-cs w:val="24"/>
+          <w:b/>
+        </w:rPr>
+        <w:t xml:space="preserve">5/9/2026</w:t>
       </w:r>
     </w:p>
     <w:p>

</xml_diff>

<commit_message>
Saving changes, while unifying the pipeline files.
</commit_message>
<xml_diff>
--- a/Documentation/Logbook.docx
+++ b/Documentation/Logbook.docx
@@ -2869,6 +2869,62 @@
           <w:b/>
         </w:rPr>
         <w:t xml:space="preserve">I have spent days trying to move my project into a slower incompatible pc and laptop, I can’t keep track of the entire file system, I should either split the extraction / probe, or datasets, I have to split the work wisely between the available hardware that I have. For example the Mac computer lacks loading QWEN 7b but it can slowly but surely load smaller models. Maybe I can split the work like this. </w:t>
+      </w:r>
+    </w:p>
+    <w:p>
+      <w:pPr>
+        <w:spacing w:after="331"/>
+      </w:pPr>
+      <w:r>
+        <w:rPr>
+          <w:rFonts w:ascii="Times" w:hAnsi="Times" w:cs="Times"/>
+          <w:sz w:val="24"/>
+          <w:sz-cs w:val="24"/>
+          <w:b/>
+        </w:rPr>
+        <w:t xml:space="preserve">Worked on another version of the pipline file and managed to bundle all the pipeline files into one main pipeline file for my project, which has more demonstration purposes than actually extracting or probing models on full datasets, it provides a user friendly explanation of what we are doing here exactly. </w:t>
+      </w:r>
+    </w:p>
+    <w:p>
+      <w:pPr>
+        <w:spacing w:after="331"/>
+      </w:pPr>
+      <w:r>
+        <w:rPr>
+          <w:rFonts w:ascii="Times" w:hAnsi="Times" w:cs="Times"/>
+          <w:sz w:val="24"/>
+          <w:sz-cs w:val="24"/>
+          <w:b/>
+        </w:rPr>
+        <w:t xml:space="preserve">I have already optimised most areas of the extraction / probing code,  I can work on other files when they run on the background and I can make audit experiments for the generated CSVs and plots.  I am building package wheels and setting up installers, preparing the code (paths), light-weight runners, matching versions and dependancies,  requirements and machine system files and operating system file requirements. All of which would be easier if I create a python class and can regulate the entire process from its constructor and parallel checks and calls. </w:t>
+      </w:r>
+    </w:p>
+    <w:p>
+      <w:pPr>
+        <w:spacing w:after="331"/>
+      </w:pPr>
+      <w:r>
+        <w:rPr>
+          <w:rFonts w:ascii="Times" w:hAnsi="Times" w:cs="Times"/>
+          <w:sz w:val="24"/>
+          <w:sz-cs w:val="24"/>
+          <w:b/>
+        </w:rPr>
+        <w:t xml:space="preserve">6/9/2026</w:t>
+      </w:r>
+    </w:p>
+    <w:p>
+      <w:pPr>
+        <w:spacing w:after="331"/>
+      </w:pPr>
+      <w:r>
+        <w:rPr>
+          <w:rFonts w:ascii="Times" w:hAnsi="Times" w:cs="Times"/>
+          <w:sz w:val="24"/>
+          <w:sz-cs w:val="24"/>
+          <w:b/>
+        </w:rPr>
+        <w:t xml:space="preserve">-</w:t>
       </w:r>
     </w:p>
     <w:p>

</xml_diff>

<commit_message>
finished pipeline, now we have a stand alone file for regular and  project space tasks, very helpful when dealing with billions of files scattered around the project's results folder
</commit_message>
<xml_diff>
--- a/Documentation/Logbook.docx
+++ b/Documentation/Logbook.docx
@@ -2924,21 +2924,21 @@
           <w:sz-cs w:val="24"/>
           <w:b/>
         </w:rPr>
-        <w:t xml:space="preserve">-</w:t>
-      </w:r>
-    </w:p>
-    <w:p>
-      <w:pPr>
-        <w:spacing w:after="331"/>
-      </w:pPr>
-      <w:r>
-        <w:rPr>
-          <w:rFonts w:ascii="Times" w:hAnsi="Times" w:cs="Times"/>
-          <w:sz w:val="24"/>
-          <w:sz-cs w:val="24"/>
-          <w:b/>
-        </w:rPr>
-        <w:t xml:space="preserve">-</w:t>
+        <w:t xml:space="preserve">Finished the work with pipeline for visualisation and demonstrations, modified the probe code to fix a problem during the run when repeats are set to 1. Improved the logic of the pipeline file, introduced new commands and novel approaches.</w:t>
+      </w:r>
+    </w:p>
+    <w:p>
+      <w:pPr>
+        <w:spacing w:after="331"/>
+      </w:pPr>
+      <w:r>
+        <w:rPr>
+          <w:rFonts w:ascii="Times" w:hAnsi="Times" w:cs="Times"/>
+          <w:sz w:val="24"/>
+          <w:sz-cs w:val="24"/>
+          <w:b/>
+        </w:rPr>
+        <w:t xml:space="preserve"/>
       </w:r>
     </w:p>
     <w:p>

</xml_diff>

<commit_message>
saving changes, logbook, starting a fresh day with fresh repo
</commit_message>
<xml_diff>
--- a/Documentation/Logbook.docx
+++ b/Documentation/Logbook.docx
@@ -2938,7 +2938,63 @@
           <w:sz-cs w:val="24"/>
           <w:b/>
         </w:rPr>
-        <w:t xml:space="preserve"/>
+        <w:t xml:space="preserve">Improved time complexity, computational complexity and storage complexity,  resulting in omitting unnecessary code, external hard rive for saving the results and proper error handling and using verbose -&gt; debugging and silent mode for fast runs. </w:t>
+      </w:r>
+    </w:p>
+    <w:p>
+      <w:pPr>
+        <w:spacing w:after="331"/>
+      </w:pPr>
+      <w:r>
+        <w:rPr>
+          <w:rFonts w:ascii="Times" w:hAnsi="Times" w:cs="Times"/>
+          <w:sz w:val="24"/>
+          <w:sz-cs w:val="24"/>
+          <w:b/>
+        </w:rPr>
+        <w:t xml:space="preserve">Next I will also unify the analyser file into one main local project file for a more specific analysis of the result and checkpoint and assert system, can also be using within the pipeline to constantly check for anomalies and analyses the newly generated results before taking the action on the final result instance. This would be a major help and a step in the right direction of moving the entire project into a single python class master, responsible for execution and orchestrating the existing files, currently we are refining the computational complexity of each function class and file so that hopefully they also would work as elegantly right next to each other from the master class of my project. </w:t>
+      </w:r>
+    </w:p>
+    <w:p>
+      <w:pPr>
+        <w:spacing w:after="331"/>
+      </w:pPr>
+      <w:r>
+        <w:rPr>
+          <w:rFonts w:ascii="Times" w:hAnsi="Times" w:cs="Times"/>
+          <w:sz w:val="24"/>
+          <w:sz-cs w:val="24"/>
+          <w:b/>
+        </w:rPr>
+        <w:t xml:space="preserve">7/9/2026</w:t>
+      </w:r>
+    </w:p>
+    <w:p>
+      <w:pPr>
+        <w:spacing w:after="331"/>
+      </w:pPr>
+      <w:r>
+        <w:rPr>
+          <w:rFonts w:ascii="Times" w:hAnsi="Times" w:cs="Times"/>
+          <w:sz w:val="24"/>
+          <w:sz-cs w:val="24"/>
+          <w:b/>
+        </w:rPr>
+        <w:t xml:space="preserve">-</w:t>
+      </w:r>
+    </w:p>
+    <w:p>
+      <w:pPr>
+        <w:spacing w:after="331"/>
+      </w:pPr>
+      <w:r>
+        <w:rPr>
+          <w:rFonts w:ascii="Times" w:hAnsi="Times" w:cs="Times"/>
+          <w:sz w:val="24"/>
+          <w:sz-cs w:val="24"/>
+          <w:b/>
+        </w:rPr>
+        <w:t xml:space="preserve">-</w:t>
       </w:r>
     </w:p>
     <w:p>

</xml_diff>

<commit_message>
Significant improvements on the Master files and their interactive method, more robust and modern methods and visualisation techniques, continue extraction of QWEN, improved readme to include my future actions.
</commit_message>
<xml_diff>
--- a/Documentation/Logbook.docx
+++ b/Documentation/Logbook.docx
@@ -2981,6 +2981,62 @@
           <w:b/>
         </w:rPr>
         <w:t xml:space="preserve">Worked on the analyser and pipeline, created a unified version of analyser for the entire project, now we can compare results, audit and analyse results using the most recent standards and visualisation and demonstration techniques. Removed overhead files and cleaned directories,  improved the documentation, commenting and explainability of the code, other minor improvements. </w:t>
+      </w:r>
+    </w:p>
+    <w:p>
+      <w:pPr>
+        <w:spacing w:after="331"/>
+      </w:pPr>
+      <w:r>
+        <w:rPr>
+          <w:rFonts w:ascii="Times" w:hAnsi="Times" w:cs="Times"/>
+          <w:sz w:val="24"/>
+          <w:sz-cs w:val="24"/>
+          <w:b/>
+        </w:rPr>
+        <w:t xml:space="preserve">The project’s file structure and purpose is so clear now that it sounds like it’s talking to me about the goal of the project,  I have refined most of my main files the only real parts missing from my current pipeline and project as a hole, is documentation, commenting and the test suite that is yet to be build. </w:t>
+      </w:r>
+    </w:p>
+    <w:p>
+      <w:pPr>
+        <w:spacing w:after="331"/>
+      </w:pPr>
+      <w:r>
+        <w:rPr>
+          <w:rFonts w:ascii="Times" w:hAnsi="Times" w:cs="Times"/>
+          <w:sz w:val="24"/>
+          <w:sz-cs w:val="24"/>
+          <w:b/>
+        </w:rPr>
+        <w:t xml:space="preserve">I’m more interested on expanding the radius of my project, with a neat pipeline and reusable classes and functions, I’m ready to explore new explainability/interpretability techniques as well as new datasets that I have already mentioned in my specification, since I have already planned for this occasion I don’t really need supervision or guidance I just have to research and implement what I have promised. </w:t>
+      </w:r>
+    </w:p>
+    <w:p>
+      <w:pPr>
+        <w:spacing w:after="331"/>
+      </w:pPr>
+      <w:r>
+        <w:rPr>
+          <w:rFonts w:ascii="Times" w:hAnsi="Times" w:cs="Times"/>
+          <w:sz w:val="24"/>
+          <w:sz-cs w:val="24"/>
+          <w:b/>
+        </w:rPr>
+        <w:t xml:space="preserve">8/9/2026</w:t>
+      </w:r>
+    </w:p>
+    <w:p>
+      <w:pPr>
+        <w:spacing w:after="331"/>
+      </w:pPr>
+      <w:r>
+        <w:rPr>
+          <w:rFonts w:ascii="Times" w:hAnsi="Times" w:cs="Times"/>
+          <w:sz w:val="24"/>
+          <w:sz-cs w:val="24"/>
+          <w:b/>
+        </w:rPr>
+        <w:t xml:space="preserve">-</w:t>
       </w:r>
     </w:p>
     <w:p>

</xml_diff>

<commit_message>
fixes in the master_dataset and successful loads of the desired datasets.
</commit_message>
<xml_diff>
--- a/Documentation/Logbook.docx
+++ b/Documentation/Logbook.docx
@@ -3023,6 +3023,118 @@
           <w:b/>
         </w:rPr>
         <w:t xml:space="preserve">8/9/2026</w:t>
+      </w:r>
+    </w:p>
+    <w:p>
+      <w:pPr>
+        <w:spacing w:after="331"/>
+      </w:pPr>
+      <w:r>
+        <w:rPr>
+          <w:rFonts w:ascii="Times" w:hAnsi="Times" w:cs="Times"/>
+          <w:sz w:val="24"/>
+          <w:sz-cs w:val="24"/>
+          <w:b/>
+        </w:rPr>
+        <w:t xml:space="preserve">Improved the Master Datasets file to include empathetic dialog and emoBank datasets as default and local datasets, I have downloaded and saved them using the very same code, and I have made a fundamental prerequisites basis for downloading and processing Any datasets regardless of their text and target labels. </w:t>
+      </w:r>
+    </w:p>
+    <w:p>
+      <w:pPr>
+        <w:spacing w:after="331"/>
+      </w:pPr>
+      <w:r>
+        <w:rPr>
+          <w:rFonts w:ascii="Times" w:hAnsi="Times" w:cs="Times"/>
+          <w:sz w:val="24"/>
+          <w:sz-cs w:val="24"/>
+          <w:b/>
+        </w:rPr>
+        <w:t xml:space="preserve">I have had progress with refining the code, each section has it’s own finished and patched code, further improvements and for generalisation and expansion purposes, therefore after adding these two new datasets into my pipeline, I would try different explainability and interpretability techniques to gather data from different perspective to back-up my claims.</w:t>
+      </w:r>
+    </w:p>
+    <w:p>
+      <w:pPr>
+        <w:spacing w:after="331"/>
+      </w:pPr>
+      <w:r>
+        <w:rPr>
+          <w:rFonts w:ascii="Times" w:hAnsi="Times" w:cs="Times"/>
+          <w:sz w:val="24"/>
+          <w:sz-cs w:val="24"/>
+          <w:b/>
+        </w:rPr>
+        <w:t xml:space="preserve">Completion of Master_Dataset, adding the new datasets into extraction pipeline,  merging the existing files into one python class that can successfully incorporate all the files, meanwhile each file which has it’s own purpose can be executed independently for a specific task. Technically I’m still behind because I don’t have enough QWEN model extraction results, the model’s configuration is fairly heavy without a Nvidia GPU. </w:t>
+      </w:r>
+    </w:p>
+    <w:p>
+      <w:pPr>
+        <w:spacing w:after="331"/>
+      </w:pPr>
+      <w:r>
+        <w:rPr>
+          <w:rFonts w:ascii="Times" w:hAnsi="Times" w:cs="Times"/>
+          <w:sz w:val="24"/>
+          <w:sz-cs w:val="24"/>
+          <w:b/>
+        </w:rPr>
+        <w:t xml:space="preserve">9/9/2026</w:t>
+      </w:r>
+    </w:p>
+    <w:p>
+      <w:pPr>
+        <w:spacing w:after="331"/>
+      </w:pPr>
+      <w:r>
+        <w:rPr>
+          <w:rFonts w:ascii="Times" w:hAnsi="Times" w:cs="Times"/>
+          <w:sz w:val="24"/>
+          <w:sz-cs w:val="24"/>
+          <w:b/>
+        </w:rPr>
+        <w:t xml:space="preserve">I have noticed something strange about my workflow, before when I tried to expand my area of project into different models, datasets, explainability and interpretability techniques, I would have normally gotten lost, but now the project’s pipeline and the final result I’m expecting have became much more clearer and expanding the project doesn’t sound like something bad, overhead or confusing. Instead it’s acting like a beacon lighting my way.</w:t>
+      </w:r>
+    </w:p>
+    <w:p>
+      <w:pPr>
+        <w:spacing w:after="331"/>
+      </w:pPr>
+      <w:r>
+        <w:rPr>
+          <w:rFonts w:ascii="Times" w:hAnsi="Times" w:cs="Times"/>
+          <w:sz w:val="24"/>
+          <w:sz-cs w:val="24"/>
+          <w:b/>
+        </w:rPr>
+        <w:t xml:space="preserve">I am working hard to implement the expansion idea that I have but it’s proving to be time consuming, specifically on how to incorporate those relevant ideas into my project and make the final submissive meta heuristic code and approach for foreign data / model / techniques (enough verbose).</w:t>
+      </w:r>
+    </w:p>
+    <w:p>
+      <w:pPr>
+        <w:spacing w:after="331"/>
+      </w:pPr>
+      <w:r>
+        <w:rPr>
+          <w:rFonts w:ascii="Times" w:hAnsi="Times" w:cs="Times"/>
+          <w:sz w:val="24"/>
+          <w:sz-cs w:val="24"/>
+          <w:b/>
+        </w:rPr>
+        <w:t xml:space="preserve">Remains from current code: Documentation, commenting, readme, spacing, naming, main class, project root structure, visualisers need improving, debugging, validation, test suites,  report writing  —— After all that — &gt;  The Expansion (new models / datasets / techniques).</w:t>
+      </w:r>
+    </w:p>
+    <w:p>
+      <w:pPr>
+        <w:spacing w:after="331"/>
+      </w:pPr>
+      <w:r>
+        <w:rPr>
+          <w:rFonts w:ascii="Times" w:hAnsi="Times" w:cs="Times"/>
+          <w:sz w:val="24"/>
+          <w:sz-cs w:val="24"/>
+          <w:b/>
+        </w:rPr>
+        <w:t xml:space="preserve">10/9/2026</w:t>
       </w:r>
     </w:p>
     <w:p>

</xml_diff>

<commit_message>
Incorporated the new datasets into the extraction code and made signifacnt improvements throughout the code.
</commit_message>
<xml_diff>
--- a/Documentation/Logbook.docx
+++ b/Documentation/Logbook.docx
@@ -3121,6 +3121,62 @@
           <w:b/>
         </w:rPr>
         <w:t xml:space="preserve">Remains from current code: Documentation, commenting, readme, spacing, naming, main class, project root structure, visualisers need improving, debugging, validation, test suites,  report writing  —— After all that — &gt;  The Expansion (new models / datasets / techniques).</w:t>
+      </w:r>
+    </w:p>
+    <w:p>
+      <w:pPr>
+        <w:spacing w:after="331"/>
+      </w:pPr>
+      <w:r>
+        <w:rPr>
+          <w:rFonts w:ascii="Times" w:hAnsi="Times" w:cs="Times"/>
+          <w:sz w:val="24"/>
+          <w:sz-cs w:val="24"/>
+          <w:b/>
+        </w:rPr>
+        <w:t xml:space="preserve">10/9/2026</w:t>
+      </w:r>
+    </w:p>
+    <w:p>
+      <w:pPr>
+        <w:spacing w:after="331"/>
+      </w:pPr>
+      <w:r>
+        <w:rPr>
+          <w:rFonts w:ascii="Times" w:hAnsi="Times" w:cs="Times"/>
+          <w:sz w:val="24"/>
+          <w:sz-cs w:val="24"/>
+          <w:b/>
+        </w:rPr>
+        <w:t xml:space="preserve">The master_dataset file now can download the raw dataset and pre-process them under a different sub folder, this is the type of result I have been working on and I’m glad to have reached here.  There are many internet connectivity issues which seems to be slowing my progress down. </w:t>
+      </w:r>
+    </w:p>
+    <w:p>
+      <w:pPr>
+        <w:spacing w:after="331"/>
+      </w:pPr>
+      <w:r>
+        <w:rPr>
+          <w:rFonts w:ascii="Times" w:hAnsi="Times" w:cs="Times"/>
+          <w:sz w:val="24"/>
+          <w:sz-cs w:val="24"/>
+          <w:b/>
+        </w:rPr>
+        <w:t xml:space="preserve">Introducing new relevant datasets is an extreme help for this project, on top of this I can download, process and use these datasets in my code with just a valid url for the source of the dataset.csv file. Some datasets are surprisingly large, like amazon’s polarity is 4m rows and approximately 2Gb of raw chunk of text, which is computationally expensive to pre-process and takes long to extract from models, however it could be worse the consistent results at the end and concluding a backed up hypothesis with valid and large data, to a no point of miss understanding (by comparing the results of different datasets).</w:t>
+      </w:r>
+    </w:p>
+    <w:p>
+      <w:pPr>
+        <w:spacing w:after="331"/>
+      </w:pPr>
+      <w:r>
+        <w:rPr>
+          <w:rFonts w:ascii="Times" w:hAnsi="Times" w:cs="Times"/>
+          <w:sz w:val="24"/>
+          <w:sz-cs w:val="24"/>
+          <w:b/>
+        </w:rPr>
+        <w:t xml:space="preserve">One core issue that I’m currently facing is that most of the resources on the internet is blocked for me, since my country blocks and filters most of the content on the internet and has infrastructure which only accepts internal sites or highly trusted platforms. And most of the highly accepted and famous platforms have blocked access from my country due to the war going on Indian Ocean and straight of Hormuz.  Therefore I am cut off from both the server and receiver ends, making my research area and content I can download highly limited and out of bound, I even have problems installing packages from pip. Nothing works without a VPN and VPNs don’t work on Mac.  AAAAAAAAHHHHHHHH.</w:t>
       </w:r>
     </w:p>
     <w:p>

</xml_diff>

<commit_message>
After losing years of extracted and saved results, I have made improvements to the code and adapted the pipeline to a new cloudfair / curl connection safe also made a one time script for re downloading the lost shards.
</commit_message>
<xml_diff>
--- a/Documentation/Logbook.docx
+++ b/Documentation/Logbook.docx
@@ -3190,21 +3190,77 @@
           <w:sz-cs w:val="24"/>
           <w:b/>
         </w:rPr>
-        <w:t xml:space="preserve">10/9/2026</w:t>
-      </w:r>
-    </w:p>
-    <w:p>
-      <w:pPr>
-        <w:spacing w:after="331"/>
-      </w:pPr>
-      <w:r>
-        <w:rPr>
-          <w:rFonts w:ascii="Times" w:hAnsi="Times" w:cs="Times"/>
-          <w:sz w:val="24"/>
-          <w:sz-cs w:val="24"/>
-          <w:b/>
-        </w:rPr>
-        <w:t xml:space="preserve">-</w:t>
+        <w:t xml:space="preserve">11/9/2026</w:t>
+      </w:r>
+    </w:p>
+    <w:p>
+      <w:pPr>
+        <w:spacing w:after="331"/>
+      </w:pPr>
+      <w:r>
+        <w:rPr>
+          <w:rFonts w:ascii="Times" w:hAnsi="Times" w:cs="Times"/>
+          <w:sz w:val="24"/>
+          <w:sz-cs w:val="24"/>
+          <w:b/>
+        </w:rPr>
+        <w:t xml:space="preserve">Due to continuous writes to me ExFat 2Tb my passport hard drive, I have lost my downloaded datasets, model shards and configuration files, my previously saved result on the hard drive is just gone. I have spent months trying to collect that data, due to lack of memory on my Mac I had to resolve to this approach, but it has failed, writing the hidden states online to google drive is also not an option, despite the internet problems in my country the size of these files, online storage options are also very expensive and not an option for me.</w:t>
+      </w:r>
+    </w:p>
+    <w:p>
+      <w:pPr>
+        <w:spacing w:after="331"/>
+      </w:pPr>
+      <w:r>
+        <w:rPr>
+          <w:rFonts w:ascii="Times" w:hAnsi="Times" w:cs="Times"/>
+          <w:sz w:val="24"/>
+          <w:sz-cs w:val="24"/>
+          <w:b/>
+        </w:rPr>
+        <w:t xml:space="preserve">At this stage I attempted to repair my external hard rive using my windows 7 pc and diskpart command,  since my Mac didn’t detect it and windows did, I scanned the hard drive for broken/corrupted/missing sectors, the hard drive was fine so I thought the issue was due to ExFat formatting which doesn’t support large model files, but it’s an convenience to use with both Mac and windows machines. I had to format my hard drive with AFPS which is not supported by windows (normally and without installing the necessary packages) but it does support my project hidden_states files. </w:t>
+      </w:r>
+    </w:p>
+    <w:p>
+      <w:pPr>
+        <w:spacing w:after="331"/>
+      </w:pPr>
+      <w:r>
+        <w:rPr>
+          <w:rFonts w:ascii="Times" w:hAnsi="Times" w:cs="Times"/>
+          <w:sz w:val="24"/>
+          <w:sz-cs w:val="24"/>
+          <w:b/>
+        </w:rPr>
+        <w:t xml:space="preserve">Since I have lost most of my work, I will use this opportunity to enhance my extraction and pre-processing pipelines, using more robust coding approaches and generalised no point of failure runs. </w:t>
+      </w:r>
+    </w:p>
+    <w:p>
+      <w:pPr>
+        <w:spacing w:after="331"/>
+      </w:pPr>
+      <w:r>
+        <w:rPr>
+          <w:rFonts w:ascii="Times" w:hAnsi="Times" w:cs="Times"/>
+          <w:sz w:val="24"/>
+          <w:sz-cs w:val="24"/>
+          <w:b/>
+        </w:rPr>
+        <w:t xml:space="preserve">12/9/2026</w:t>
+      </w:r>
+    </w:p>
+    <w:p>
+      <w:pPr>
+        <w:spacing w:after="331"/>
+      </w:pPr>
+      <w:r>
+        <w:rPr>
+          <w:rFonts w:ascii="Times" w:hAnsi="Times" w:cs="Times"/>
+          <w:sz w:val="24"/>
+          <w:sz-cs w:val="24"/>
+          <w:b/>
+        </w:rPr>
+        <w:t xml:space="preserve">Made stable connection tokens via cloud fair </w:t>
       </w:r>
     </w:p>
     <w:p>

</xml_diff>

<commit_message>
temporary issue while pushing, large files detected in commit tree branch
</commit_message>
<xml_diff>
--- a/Documentation/Logbook.docx
+++ b/Documentation/Logbook.docx
@@ -3260,21 +3260,21 @@
           <w:sz-cs w:val="24"/>
           <w:b/>
         </w:rPr>
-        <w:t xml:space="preserve">Made stable connection tokens via cloud fair </w:t>
-      </w:r>
-    </w:p>
-    <w:p>
-      <w:pPr>
-        <w:spacing w:after="331"/>
-      </w:pPr>
-      <w:r>
-        <w:rPr>
-          <w:rFonts w:ascii="Times" w:hAnsi="Times" w:cs="Times"/>
-          <w:sz w:val="24"/>
-          <w:sz-cs w:val="24"/>
-          <w:b/>
-        </w:rPr>
-        <w:t xml:space="preserve">-</w:t>
+        <w:t xml:space="preserve">Made stable connection tokens via cloud fair, I have mostly cleaned the project structure and the underlying program. </w:t>
+      </w:r>
+    </w:p>
+    <w:p>
+      <w:pPr>
+        <w:spacing w:after="331"/>
+      </w:pPr>
+      <w:r>
+        <w:rPr>
+          <w:rFonts w:ascii="Times" w:hAnsi="Times" w:cs="Times"/>
+          <w:sz w:val="24"/>
+          <w:sz-cs w:val="24"/>
+          <w:b/>
+        </w:rPr>
+        <w:t xml:space="preserve">One suggestion that came into my mind was, creating a very linear (monoloth) pipeline in which I process one row of text and then send that over to extract code and extract that very single row of data  </w:t>
       </w:r>
     </w:p>
     <w:p>

</xml_diff>

<commit_message>
significant improvements to the master dataset and extraction pipeline, to add and test the new datasets and models and getting back on the right track
</commit_message>
<xml_diff>
--- a/Documentation/Logbook.docx
+++ b/Documentation/Logbook.docx
@@ -3260,21 +3260,77 @@
           <w:sz-cs w:val="24"/>
           <w:b/>
         </w:rPr>
-        <w:t xml:space="preserve">Made stable connection tokens via cloud fair, I have mostly cleaned the project structure and the underlying program. </w:t>
-      </w:r>
-    </w:p>
-    <w:p>
-      <w:pPr>
-        <w:spacing w:after="331"/>
-      </w:pPr>
-      <w:r>
-        <w:rPr>
-          <w:rFonts w:ascii="Times" w:hAnsi="Times" w:cs="Times"/>
-          <w:sz w:val="24"/>
-          <w:sz-cs w:val="24"/>
-          <w:b/>
-        </w:rPr>
-        <w:t xml:space="preserve">One suggestion that came into my mind was, creating a very linear (monoloth) pipeline in which I process one row of text and then send that over to extract code and extract that very single row of data  </w:t>
+        <w:t xml:space="preserve">Made stable connection tokens via cloud fair, now I can bypass the internet limitations for most of my project areas, I have mostly cleaned the project structure and the underlying program. downloaded some of the models including QWEN to continue extraction.</w:t>
+      </w:r>
+    </w:p>
+    <w:p>
+      <w:pPr>
+        <w:spacing w:after="331"/>
+      </w:pPr>
+      <w:r>
+        <w:rPr>
+          <w:rFonts w:ascii="Times" w:hAnsi="Times" w:cs="Times"/>
+          <w:sz w:val="24"/>
+          <w:sz-cs w:val="24"/>
+          <w:b/>
+        </w:rPr>
+        <w:t xml:space="preserve">One suggestion that came into my mind was, creating a very linear (monoloth) pipeline in which I process one row of text and then send that over to extract code and extract that very single row of data. I have also made a usable file for downloading the models again if we lose them, we just need a cloud fair token. </w:t>
+      </w:r>
+    </w:p>
+    <w:p>
+      <w:pPr>
+        <w:spacing w:after="331"/>
+      </w:pPr>
+      <w:r>
+        <w:rPr>
+          <w:rFonts w:ascii="Times" w:hAnsi="Times" w:cs="Times"/>
+          <w:sz w:val="24"/>
+          <w:sz-cs w:val="24"/>
+          <w:b/>
+        </w:rPr>
+        <w:t xml:space="preserve">Continue over the extraction and probing the models, try to extract meaningful results from the final results and their plots, move over other interpretability and explainability techniques. I have already placed over 7 datasets with emotion labels for targets, and my code allows me to remotely download process and use the dataset to extract hidden states. </w:t>
+      </w:r>
+    </w:p>
+    <w:p>
+      <w:pPr>
+        <w:spacing w:after="331"/>
+      </w:pPr>
+      <w:r>
+        <w:rPr>
+          <w:rFonts w:ascii="Times" w:hAnsi="Times" w:cs="Times"/>
+          <w:sz w:val="24"/>
+          <w:sz-cs w:val="24"/>
+          <w:b/>
+        </w:rPr>
+        <w:t xml:space="preserve">12/9/2026</w:t>
+      </w:r>
+    </w:p>
+    <w:p>
+      <w:pPr>
+        <w:spacing w:after="331"/>
+      </w:pPr>
+      <w:r>
+        <w:rPr>
+          <w:rFonts w:ascii="Times" w:hAnsi="Times" w:cs="Times"/>
+          <w:sz w:val="24"/>
+          <w:sz-cs w:val="24"/>
+          <w:b/>
+        </w:rPr>
+        <w:t xml:space="preserve">Significant improvement to the master dataset file, to include 5 new datasets and developed an open platform for remotely downloading and processing any dataset, using just their url. </w:t>
+      </w:r>
+    </w:p>
+    <w:p>
+      <w:pPr>
+        <w:spacing w:after="331"/>
+      </w:pPr>
+      <w:r>
+        <w:rPr>
+          <w:rFonts w:ascii="Times" w:hAnsi="Times" w:cs="Times"/>
+          <w:sz w:val="24"/>
+          <w:sz-cs w:val="24"/>
+          <w:b/>
+        </w:rPr>
+        <w:t xml:space="preserve">-</w:t>
       </w:r>
     </w:p>
     <w:p>

</xml_diff>

<commit_message>
modifications to the dataset, extraction pipeline, new helpers and a stable pipeline for extracting hidden states is stablished
</commit_message>
<xml_diff>
--- a/Documentation/Logbook.docx
+++ b/Documentation/Logbook.docx
@@ -3317,6 +3317,118 @@
           <w:b/>
         </w:rPr>
         <w:t xml:space="preserve">Significant improvement to the master dataset file, to include 5 new datasets and developed an open platform for remotely downloading and processing any dataset, using just their url. </w:t>
+      </w:r>
+    </w:p>
+    <w:p>
+      <w:pPr>
+        <w:spacing w:after="331"/>
+      </w:pPr>
+      <w:r>
+        <w:rPr>
+          <w:rFonts w:ascii="Times" w:hAnsi="Times" w:cs="Times"/>
+          <w:sz w:val="24"/>
+          <w:sz-cs w:val="24"/>
+          <w:b/>
+        </w:rPr>
+        <w:t xml:space="preserve">-</w:t>
+      </w:r>
+    </w:p>
+    <w:p>
+      <w:pPr>
+        <w:spacing w:after="331"/>
+      </w:pPr>
+      <w:r>
+        <w:rPr>
+          <w:rFonts w:ascii="Times" w:hAnsi="Times" w:cs="Times"/>
+          <w:sz w:val="24"/>
+          <w:sz-cs w:val="24"/>
+          <w:b/>
+        </w:rPr>
+        <w:t xml:space="preserve">-</w:t>
+      </w:r>
+    </w:p>
+    <w:p>
+      <w:pPr>
+        <w:spacing w:after="331"/>
+      </w:pPr>
+      <w:r>
+        <w:rPr>
+          <w:rFonts w:ascii="Times" w:hAnsi="Times" w:cs="Times"/>
+          <w:sz w:val="24"/>
+          <w:sz-cs w:val="24"/>
+          <w:b/>
+        </w:rPr>
+        <w:t xml:space="preserve">16/9/2026</w:t>
+      </w:r>
+    </w:p>
+    <w:p>
+      <w:pPr>
+        <w:spacing w:after="331"/>
+      </w:pPr>
+      <w:r>
+        <w:rPr>
+          <w:rFonts w:ascii="Times" w:hAnsi="Times" w:cs="Times"/>
+          <w:sz w:val="24"/>
+          <w:sz-cs w:val="24"/>
+          <w:b/>
+        </w:rPr>
+        <w:t xml:space="preserve">Had some personal issues over the past few days and couldn’t even touch my project for a few days. I have recently lost all my downloaded models, their extracted hidden states as well as the probing result, due to some formatting issue with my external hardrive (ExFat does not support large model files properly, AFPS is a much more valid option) and after resolving the issue with my storage, I have made several modifications to the code, now that I have the chance (excuse) to work on a new pipeline with faster and more nuanced explanation from the code. </w:t>
+      </w:r>
+    </w:p>
+    <w:p>
+      <w:pPr>
+        <w:spacing w:after="331"/>
+      </w:pPr>
+      <w:r>
+        <w:rPr>
+          <w:rFonts w:ascii="Times" w:hAnsi="Times" w:cs="Times"/>
+          <w:sz w:val="24"/>
+          <w:sz-cs w:val="24"/>
+          <w:b/>
+        </w:rPr>
+        <w:t xml:space="preserve">Made stable download files, for properly downloading the hugging face models directly on my disk, have made some modifications to the extraction path logic to use a new structure for saving the results and raw materials. Due to current internet limitations in Iran due to the current war, I am blocked from accessing hugging face model’s configuration files, I’ll have to either use a vpn, curl connection or a cloud fair worker which can perform this cross platform task. </w:t>
+      </w:r>
+    </w:p>
+    <w:p>
+      <w:pPr>
+        <w:spacing w:after="331"/>
+      </w:pPr>
+      <w:r>
+        <w:rPr>
+          <w:rFonts w:ascii="Times" w:hAnsi="Times" w:cs="Times"/>
+          <w:sz w:val="24"/>
+          <w:sz-cs w:val="24"/>
+          <w:b/>
+        </w:rPr>
+        <w:t xml:space="preserve">I have really fallen behind my project timeline, a month ago I had a working code which was constantly extracting hidden states and probing the result from another file while reading the same saved result by extraction. Now that I have the chance to adapt a new pipeline, maybe I can make the process contagious. From downloading the model and dataset to pre=processing, extracting and probing them. Using a single python class and my already separated project files. </w:t>
+      </w:r>
+    </w:p>
+    <w:p>
+      <w:pPr>
+        <w:spacing w:after="331"/>
+      </w:pPr>
+      <w:r>
+        <w:rPr>
+          <w:rFonts w:ascii="Times" w:hAnsi="Times" w:cs="Times"/>
+          <w:sz w:val="24"/>
+          <w:sz-cs w:val="24"/>
+          <w:b/>
+        </w:rPr>
+        <w:t xml:space="preserve">17/9/2026</w:t>
+      </w:r>
+    </w:p>
+    <w:p>
+      <w:pPr>
+        <w:spacing w:after="331"/>
+      </w:pPr>
+      <w:r>
+        <w:rPr>
+          <w:rFonts w:ascii="Times" w:hAnsi="Times" w:cs="Times"/>
+          <w:sz w:val="24"/>
+          <w:sz-cs w:val="24"/>
+          <w:b/>
+        </w:rPr>
+        <w:t xml:space="preserve">-</w:t>
       </w:r>
     </w:p>
     <w:p>

</xml_diff>

<commit_message>
significant bug fixes and improvements, corrected paths, changes output structure and their folder structure. updated the extraction / probing logic and atomic writes. made project files agree on a single layout for output which they all respect and interact with without interupting eachother.
</commit_message>
<xml_diff>
--- a/Documentation/Logbook.docx
+++ b/Documentation/Logbook.docx
@@ -3400,21 +3400,77 @@
           <w:sz-cs w:val="24"/>
           <w:b/>
         </w:rPr>
-        <w:t xml:space="preserve">I have really fallen behind my project timeline, a month ago I had a working code which was constantly extracting hidden states and probing the result from another file while reading the same saved result by extraction. Now that I have the chance to adapt a new pipeline, maybe I can make the process contagious. From downloading the model and dataset to pre=processing, extracting and probing them. Using a single python class and my already separated project files. </w:t>
-      </w:r>
-    </w:p>
-    <w:p>
-      <w:pPr>
-        <w:spacing w:after="331"/>
-      </w:pPr>
-      <w:r>
-        <w:rPr>
-          <w:rFonts w:ascii="Times" w:hAnsi="Times" w:cs="Times"/>
-          <w:sz w:val="24"/>
-          <w:sz-cs w:val="24"/>
-          <w:b/>
-        </w:rPr>
-        <w:t xml:space="preserve">17/9/2026</w:t>
+        <w:t xml:space="preserve">I have really fallen behind my project timeline, a month ago I had a working code which was constantly extracting hidden states and probing the result from another file while reading the same saved result by extraction. Now that I have the chance to adapt a new pipeline, maybe I can make the process contagious. From downloading the model and dataset to pre-processing, extracting and probing them. Using a single python class and my already separated project files. </w:t>
+      </w:r>
+    </w:p>
+    <w:p>
+      <w:pPr>
+        <w:spacing w:after="331"/>
+      </w:pPr>
+      <w:r>
+        <w:rPr>
+          <w:rFonts w:ascii="Times" w:hAnsi="Times" w:cs="Times"/>
+          <w:sz w:val="24"/>
+          <w:sz-cs w:val="24"/>
+          <w:b/>
+        </w:rPr>
+        <w:t xml:space="preserve">19/9/2026</w:t>
+      </w:r>
+    </w:p>
+    <w:p>
+      <w:pPr>
+        <w:spacing w:after="331"/>
+      </w:pPr>
+      <w:r>
+        <w:rPr>
+          <w:rFonts w:ascii="Times" w:hAnsi="Times" w:cs="Times"/>
+          <w:sz w:val="24"/>
+          <w:sz-cs w:val="24"/>
+          <w:b/>
+        </w:rPr>
+        <w:t xml:space="preserve">Continued over the extraction and constructed a reliable runtime code adaptive with kernel crashes and internet filters. Added the new QWEN3 series’s tiny models into my pipeline, Documentation for the code, logbook, final report and commenting. Organised project root structure and the results folder structure. </w:t>
+      </w:r>
+    </w:p>
+    <w:p>
+      <w:pPr>
+        <w:spacing w:after="331"/>
+      </w:pPr>
+      <w:r>
+        <w:rPr>
+          <w:rFonts w:ascii="Times" w:hAnsi="Times" w:cs="Times"/>
+          <w:sz w:val="24"/>
+          <w:sz-cs w:val="24"/>
+          <w:b/>
+        </w:rPr>
+        <w:t xml:space="preserve">I have had some difficulty refining the master datasets file to generalise to new datasets, though I have a clear idea of what I should do to achieve it, since we are only interested in text and target columns and no other data is vital for our research (maybe a sentiment score in the future).  </w:t>
+      </w:r>
+    </w:p>
+    <w:p>
+      <w:pPr>
+        <w:spacing w:after="331"/>
+      </w:pPr>
+      <w:r>
+        <w:rPr>
+          <w:rFonts w:ascii="Times" w:hAnsi="Times" w:cs="Times"/>
+          <w:sz w:val="24"/>
+          <w:sz-cs w:val="24"/>
+          <w:b/>
+        </w:rPr>
+        <w:t xml:space="preserve">I have the extractor and the probe code running alongside each other, one writing the hidden states and the other one is reading it and training probes with it. The entire process is more time consuming than technical, I have to wait for hours to notice a progress or a result worth analysing. This is the main reason why I have decided to move on to new explainability and interpretability techniques. </w:t>
+      </w:r>
+    </w:p>
+    <w:p>
+      <w:pPr>
+        <w:spacing w:after="331"/>
+      </w:pPr>
+      <w:r>
+        <w:rPr>
+          <w:rFonts w:ascii="Times" w:hAnsi="Times" w:cs="Times"/>
+          <w:sz w:val="24"/>
+          <w:sz-cs w:val="24"/>
+          <w:b/>
+        </w:rPr>
+        <w:t xml:space="preserve">20/9/2026</w:t>
       </w:r>
     </w:p>
     <w:p>

</xml_diff>

<commit_message>
improvements to the probing code, new explainability and interpretability techniques added partially and is runable from wired.py, docstrings and logbook update.
</commit_message>
<xml_diff>
--- a/Documentation/Logbook.docx
+++ b/Documentation/Logbook.docx
@@ -3471,6 +3471,118 @@
           <w:b/>
         </w:rPr>
         <w:t xml:space="preserve">20/9/2026</w:t>
+      </w:r>
+    </w:p>
+    <w:p>
+      <w:pPr>
+        <w:spacing w:after="331"/>
+      </w:pPr>
+      <w:r>
+        <w:rPr>
+          <w:rFonts w:ascii="Times" w:hAnsi="Times" w:cs="Times"/>
+          <w:sz w:val="24"/>
+          <w:sz-cs w:val="24"/>
+          <w:b/>
+        </w:rPr>
+        <w:t xml:space="preserve">I have made significant improvements to the extraction / probing pipeline and made the entire code, general, autonomous, smart and atomic (collision free). Since the process of extraction as well as training the probes on the hidden states takes more time than anticipated, one probe takes about 2-3 hours to do 2 repeats. </w:t>
+      </w:r>
+    </w:p>
+    <w:p>
+      <w:pPr>
+        <w:spacing w:after="331"/>
+      </w:pPr>
+      <w:r>
+        <w:rPr>
+          <w:rFonts w:ascii="Times" w:hAnsi="Times" w:cs="Times"/>
+          <w:sz w:val="24"/>
+          <w:sz-cs w:val="24"/>
+          <w:b/>
+        </w:rPr>
+        <w:t xml:space="preserve">Given my situation and the fact that I have already lost all my results once due to external storage corruption / format miss match therefore I have decided to also work on other explainability and interpretability techniques, I have already added the new datasets. I will write the necessary project files for implementing each techniques, along with their explanation. Since almost 2 years has past since I have conducted the research for materials and requirements, I have promised old explainability techniques in my specification. But that will not stop me from gathering and applying the latest advancements, libraries and techniques regarding this project. </w:t>
+      </w:r>
+    </w:p>
+    <w:p>
+      <w:pPr>
+        <w:spacing w:after="331"/>
+      </w:pPr>
+      <w:r>
+        <w:rPr>
+          <w:rFonts w:ascii="Times" w:hAnsi="Times" w:cs="Times"/>
+          <w:sz w:val="24"/>
+          <w:sz-cs w:val="24"/>
+          <w:b/>
+        </w:rPr>
+        <w:t xml:space="preserve">I have researched the latest explainability / interpretability techniques and managed to implement the 10 most relative to my work and least time consuming, I have promised techniques like LIME and SHAP in my specification and will refer to them if time allows me, but for now instead of going after what was promised in extra I’ll go for latest advancements and attempt to implement and learn from them. </w:t>
+      </w:r>
+    </w:p>
+    <w:p>
+      <w:pPr>
+        <w:spacing w:after="331"/>
+      </w:pPr>
+      <w:r>
+        <w:rPr>
+          <w:rFonts w:ascii="Times" w:hAnsi="Times" w:cs="Times"/>
+          <w:sz w:val="24"/>
+          <w:sz-cs w:val="24"/>
+          <w:b/>
+        </w:rPr>
+        <w:t xml:space="preserve">21/9/2026</w:t>
+      </w:r>
+    </w:p>
+    <w:p>
+      <w:pPr>
+        <w:spacing w:after="331"/>
+      </w:pPr>
+      <w:r>
+        <w:rPr>
+          <w:rFonts w:ascii="Times" w:hAnsi="Times" w:cs="Times"/>
+          <w:sz w:val="24"/>
+          <w:sz-cs w:val="24"/>
+          <w:b/>
+        </w:rPr>
+        <w:t xml:space="preserve">Improvements and fixes for probe.py and extraction, i have faced some issue here for constructing the dataset contracts from scratch, previously I had isear and goemo datasets and had their contracts already made specific to them.  But now I have placed 8 datasets into my pipeline and can add them easily via a url and have their raw at my processing code. I think it’s a better idea to split the isear and goemo contracts into something like single and multi label classifications. Then I would hopefully be able to accept any dataset for probe and the code wouldn’t require manually writing the contracts for each dataset you add. </w:t>
+      </w:r>
+    </w:p>
+    <w:p>
+      <w:pPr>
+        <w:spacing w:after="331"/>
+      </w:pPr>
+      <w:r>
+        <w:rPr>
+          <w:rFonts w:ascii="Times" w:hAnsi="Times" w:cs="Times"/>
+          <w:sz w:val="24"/>
+          <w:sz-cs w:val="24"/>
+          <w:b/>
+        </w:rPr>
+        <w:t xml:space="preserve">Implementing new explainability / interpretability techniques under their own files and using a shared file to act like a bus for my project. Updating the probe logic so it would write atomically and to automatically accept any dataset, purely though the fact that they are single label or multi label, other parameters here would be pre processed and regulated by the probe + dataset + hidden states code.  The computational complexity for probing is higher than that of the extraction, allowing parallel execution for each mode x next_dataset. </w:t>
+      </w:r>
+    </w:p>
+    <w:p>
+      <w:pPr>
+        <w:spacing w:after="331"/>
+      </w:pPr>
+      <w:r>
+        <w:rPr>
+          <w:rFonts w:ascii="Times" w:hAnsi="Times" w:cs="Times"/>
+          <w:sz w:val="24"/>
+          <w:sz-cs w:val="24"/>
+          <w:b/>
+        </w:rPr>
+        <w:t xml:space="preserve">After finishing the suggested correction, I’ll research more on the latest advancement and techniques which could be used for my project, meanwhile I’ll have the code running, extracting hidden states and probing them at the same time. I have red a few papers about probing on QWEN3 models which are suggesting that probing task is void and it does not learn the emotional representations but the nuanced emotional data decoded in the text itself and the model is not learning emotions it is learning the datasets we give them. </w:t>
+      </w:r>
+    </w:p>
+    <w:p>
+      <w:pPr>
+        <w:spacing w:after="331"/>
+      </w:pPr>
+      <w:r>
+        <w:rPr>
+          <w:rFonts w:ascii="Times" w:hAnsi="Times" w:cs="Times"/>
+          <w:sz w:val="24"/>
+          <w:sz-cs w:val="24"/>
+          <w:b/>
+        </w:rPr>
+        <w:t xml:space="preserve">21/9/2026</w:t>
       </w:r>
     </w:p>
     <w:p>

</xml_diff>

<commit_message>
Bug fixes and improvements to the main pipeline, improvements to the new interpretability techniques, new project output structure, updated logbook, red a few articles on the same area of research as me, and my project needs alot of improvements and research to reach an acceptable academic contribution.
</commit_message>
<xml_diff>
--- a/Documentation/Logbook.docx
+++ b/Documentation/Logbook.docx
@@ -3582,21 +3582,21 @@
           <w:sz-cs w:val="24"/>
           <w:b/>
         </w:rPr>
-        <w:t xml:space="preserve">21/9/2026</w:t>
-      </w:r>
-    </w:p>
-    <w:p>
-      <w:pPr>
-        <w:spacing w:after="331"/>
-      </w:pPr>
-      <w:r>
-        <w:rPr>
-          <w:rFonts w:ascii="Times" w:hAnsi="Times" w:cs="Times"/>
-          <w:sz w:val="24"/>
-          <w:sz-cs w:val="24"/>
-          <w:b/>
-        </w:rPr>
-        <w:t xml:space="preserve">-</w:t>
+        <w:t xml:space="preserve">22/9/2026</w:t>
+      </w:r>
+    </w:p>
+    <w:p>
+      <w:pPr>
+        <w:spacing w:after="331"/>
+      </w:pPr>
+      <w:r>
+        <w:rPr>
+          <w:rFonts w:ascii="Times" w:hAnsi="Times" w:cs="Times"/>
+          <w:sz w:val="24"/>
+          <w:sz-cs w:val="24"/>
+          <w:b/>
+        </w:rPr>
+        <w:t xml:space="preserve">Improvements to the probing code, bug and format fixes in extraction.py, made significant contributions to the explainability and interpretability techniques partially implemented.  new structure for saving the probes and their configurations as well as some minor fixes in extraction on how to be red by the probe. changed the structure of the output dir (external hardrive). </w:t>
       </w:r>
     </w:p>
     <w:p>

</xml_diff>

<commit_message>
Signifiacnt changes to project file structure and paths, new dataset contract system, new probe + extraction mechanism and paths.
</commit_message>
<xml_diff>
--- a/Documentation/Logbook.docx
+++ b/Documentation/Logbook.docx
@@ -3597,6 +3597,62 @@
           <w:b/>
         </w:rPr>
         <w:t xml:space="preserve">Improvements to the probing code, bug and format fixes in extraction.py, made significant contributions to the explainability and interpretability techniques partially implemented.  new structure for saving the probes and their configurations as well as some minor fixes in extraction on how to be red by the probe. changed the structure of the output dir (external hardrive). </w:t>
+      </w:r>
+    </w:p>
+    <w:p>
+      <w:pPr>
+        <w:spacing w:after="331"/>
+      </w:pPr>
+      <w:r>
+        <w:rPr>
+          <w:rFonts w:ascii="Times" w:hAnsi="Times" w:cs="Times"/>
+          <w:sz w:val="24"/>
+          <w:sz-cs w:val="24"/>
+          <w:b/>
+        </w:rPr>
+        <w:t xml:space="preserve">I have red several papers and found out the latest findings and trends in my area of research, since the past 2 years the research on the topic I am has been increasing quadratically, leaving the question of how I should keep progressing this research project to introduce something new and novel. Since some papers are trying to answer the same question I am, I have to adjust my plan and course of action to not match that of the papers I have red. The scope of the project and the work already done on the area + the complexity of the project and demonstration of results can be extremely challenging when competing with other researchers.  </w:t>
+      </w:r>
+    </w:p>
+    <w:p>
+      <w:pPr>
+        <w:spacing w:after="331"/>
+      </w:pPr>
+      <w:r>
+        <w:rPr>
+          <w:rFonts w:ascii="Times" w:hAnsi="Times" w:cs="Times"/>
+          <w:sz w:val="24"/>
+          <w:sz-cs w:val="24"/>
+          <w:b/>
+        </w:rPr>
+        <w:t xml:space="preserve">For my next course of action, maybe I could contact the assigned tutor for advice and also to help find my own supervisor and keep this project on the right path. I have faced numerous constraints on this project, however my passion for this specific collision of fields drives me to complete the project regardless. Some papers had code bases on GitHub similar to my project, I should also look at them and compare the quality of work and results. </w:t>
+      </w:r>
+    </w:p>
+    <w:p>
+      <w:pPr>
+        <w:spacing w:after="331"/>
+      </w:pPr>
+      <w:r>
+        <w:rPr>
+          <w:rFonts w:ascii="Times" w:hAnsi="Times" w:cs="Times"/>
+          <w:sz w:val="24"/>
+          <w:sz-cs w:val="24"/>
+          <w:b/>
+        </w:rPr>
+        <w:t xml:space="preserve">23/9/2026</w:t>
+      </w:r>
+    </w:p>
+    <w:p>
+      <w:pPr>
+        <w:spacing w:after="331"/>
+      </w:pPr>
+      <w:r>
+        <w:rPr>
+          <w:rFonts w:ascii="Times" w:hAnsi="Times" w:cs="Times"/>
+          <w:sz w:val="24"/>
+          <w:sz-cs w:val="24"/>
+          <w:b/>
+        </w:rPr>
+        <w:t xml:space="preserve">-</w:t>
       </w:r>
     </w:p>
     <w:p>

</xml_diff>

<commit_message>
updated the runners, continue over the extraction and probing, logbook, papers
</commit_message>
<xml_diff>
--- a/Documentation/Logbook.docx
+++ b/Documentation/Logbook.docx
@@ -3639,6 +3639,174 @@
           <w:b/>
         </w:rPr>
         <w:t xml:space="preserve">23/9/2026</w:t>
+      </w:r>
+    </w:p>
+    <w:p>
+      <w:pPr>
+        <w:spacing w:after="331"/>
+      </w:pPr>
+      <w:r>
+        <w:rPr>
+          <w:rFonts w:ascii="Times" w:hAnsi="Times" w:cs="Times"/>
+          <w:sz w:val="24"/>
+          <w:sz-cs w:val="24"/>
+          <w:b/>
+        </w:rPr>
+        <w:t xml:space="preserve">Slight improvements for the extraction and probing workflow, reduced overhead and increased the overall runtime speed. Updated the runners and new doc strings for explainability of the code.  New dataset contract system and obtaining schema from urls and row / column analysis. </w:t>
+      </w:r>
+    </w:p>
+    <w:p>
+      <w:pPr>
+        <w:spacing w:after="331"/>
+      </w:pPr>
+      <w:r>
+        <w:rPr>
+          <w:rFonts w:ascii="Times" w:hAnsi="Times" w:cs="Times"/>
+          <w:sz w:val="24"/>
+          <w:sz-cs w:val="24"/>
+          <w:b/>
+        </w:rPr>
+        <w:t xml:space="preserve">I have been improving the new explainability and interpretability techniques, which can be used to measure the same model from different perspectives and contributing to the results and shaping our final answer. For now I have only implemented a draft version of the most effective methods just for including them in the pipeline. </w:t>
+      </w:r>
+    </w:p>
+    <w:p>
+      <w:pPr>
+        <w:spacing w:after="331"/>
+      </w:pPr>
+      <w:r>
+        <w:rPr>
+          <w:rFonts w:ascii="Times" w:hAnsi="Times" w:cs="Times"/>
+          <w:sz w:val="24"/>
+          <w:sz-cs w:val="24"/>
+          <w:b/>
+        </w:rPr>
+        <w:t xml:space="preserve">Next up I’m going to keep checking and validating the accuracy and integrity of my result and data with hard stone proofs assertions, I have also saved a few papers which I’m reading along, while waiting for the probe to finish and start it’s analysis. </w:t>
+      </w:r>
+    </w:p>
+    <w:p>
+      <w:pPr>
+        <w:spacing w:after="331"/>
+      </w:pPr>
+      <w:r>
+        <w:rPr>
+          <w:rFonts w:ascii="Times" w:hAnsi="Times" w:cs="Times"/>
+          <w:sz w:val="24"/>
+          <w:sz-cs w:val="24"/>
+          <w:b/>
+        </w:rPr>
+        <w:t xml:space="preserve">24/9/2026</w:t>
+      </w:r>
+    </w:p>
+    <w:p>
+      <w:pPr>
+        <w:spacing w:after="331"/>
+      </w:pPr>
+      <w:r>
+        <w:rPr>
+          <w:rFonts w:ascii="Times" w:hAnsi="Times" w:cs="Times"/>
+          <w:sz w:val="24"/>
+          <w:sz-cs w:val="24"/>
+          <w:b/>
+        </w:rPr>
+        <w:t xml:space="preserve">New runners made from scratch,  updated the _shared.py to include the shared paths, function and other variables which will be used throughout the code and is being repeated in two or more files. Wrote a file for deleting incorrect and incompatible results.  Improvements to wrired.py to successfully bundle and execute all the helper python files irrelevant to probing but explaining the models. </w:t>
+      </w:r>
+    </w:p>
+    <w:p>
+      <w:pPr>
+        <w:spacing w:after="331"/>
+      </w:pPr>
+      <w:r>
+        <w:rPr>
+          <w:rFonts w:ascii="Times" w:hAnsi="Times" w:cs="Times"/>
+          <w:sz w:val="24"/>
+          <w:sz-cs w:val="24"/>
+          <w:b/>
+        </w:rPr>
+        <w:t xml:space="preserve">Changed the structure for project files and generated results on external drive root,  wrote a probe specific analyser which checks for generated probes and performs a general analysis and uses those to plot layer wise score along other ground truth experiments which helps clear this project, like true labels vs shuffled labels can explicitly show how the probes are learning noise. (Has something to do with mapping letter in words, words in sentence and data to data generally to learn an invalid representation)</w:t>
+      </w:r>
+    </w:p>
+    <w:p>
+      <w:pPr>
+        <w:spacing w:after="331"/>
+      </w:pPr>
+      <w:r>
+        <w:rPr>
+          <w:rFonts w:ascii="Times" w:hAnsi="Times" w:cs="Times"/>
+          <w:sz w:val="24"/>
+          <w:sz-cs w:val="24"/>
+          <w:b/>
+        </w:rPr>
+        <w:t xml:space="preserve">I am currently reading papers and adding new models and datasets relevant to my project directly from and into my pipeline.  Will continue over probing and by comparing our results, it is expected to observe a repeating curve, which should give a hint on encoded emotional representations. </w:t>
+      </w:r>
+    </w:p>
+    <w:p>
+      <w:pPr>
+        <w:spacing w:after="331"/>
+      </w:pPr>
+      <w:r>
+        <w:rPr>
+          <w:rFonts w:ascii="Times" w:hAnsi="Times" w:cs="Times"/>
+          <w:sz w:val="24"/>
+          <w:sz-cs w:val="24"/>
+          <w:b/>
+        </w:rPr>
+        <w:t xml:space="preserve">25/9/2026</w:t>
+      </w:r>
+    </w:p>
+    <w:p>
+      <w:pPr>
+        <w:spacing w:after="331"/>
+      </w:pPr>
+      <w:r>
+        <w:rPr>
+          <w:rFonts w:ascii="Times" w:hAnsi="Times" w:cs="Times"/>
+          <w:sz w:val="24"/>
+          <w:sz-cs w:val="24"/>
+          <w:b/>
+        </w:rPr>
+        <w:t xml:space="preserve">The progress on extracting one dataset x models then using it’s artefact to -&gt; probe hidden states takes a lot of time and computational power to execute, the estimated time for completing all models and datasets with one hyper parameter setting takes about 28 days, I’m working on a new runner configuration to get my results after for now, we can focus on getting the complete results while we are validating the results of the lighter trial with more considered hyper parameters for a meaningful result (the shape of the curve has to be preserved) with only the first 5000 samples.</w:t>
+      </w:r>
+    </w:p>
+    <w:p>
+      <w:pPr>
+        <w:spacing w:after="331"/>
+      </w:pPr>
+      <w:r>
+        <w:rPr>
+          <w:rFonts w:ascii="Times" w:hAnsi="Times" w:cs="Times"/>
+          <w:sz w:val="24"/>
+          <w:sz-cs w:val="24"/>
+          <w:b/>
+        </w:rPr>
+        <w:t xml:space="preserve">The new probe runner file is approaximately 35 times faster than the one with old configurations, it only needs 12 hours to complete the full matrix while preserving the curve. In this time I have contributed to the other explainability / interpretability methods and red relevant papers I have saved up. </w:t>
+      </w:r>
+    </w:p>
+    <w:p>
+      <w:pPr>
+        <w:spacing w:after="331"/>
+      </w:pPr>
+      <w:r>
+        <w:rPr>
+          <w:rFonts w:ascii="Times" w:hAnsi="Times" w:cs="Times"/>
+          <w:sz w:val="24"/>
+          <w:sz-cs w:val="24"/>
+          <w:b/>
+        </w:rPr>
+        <w:t xml:space="preserve">I have red a few articles on the same area of research as me, but they haven’t used this many different models and datasets across different architectures and task types. This can be a valid starting point to compare their results with my own and try to come to the same conclusion, most of the papers have focused on a large model with a relevant dataset to perform probing, since I don’t have the computational power to run bugger models, maybe I can take advantage of someone else’s research for not reinventing the art and validating my result in different depths.</w:t>
+      </w:r>
+    </w:p>
+    <w:p>
+      <w:pPr>
+        <w:spacing w:after="331"/>
+      </w:pPr>
+      <w:r>
+        <w:rPr>
+          <w:rFonts w:ascii="Times" w:hAnsi="Times" w:cs="Times"/>
+          <w:sz w:val="24"/>
+          <w:sz-cs w:val="24"/>
+          <w:b/>
+        </w:rPr>
+        <w:t xml:space="preserve">26/9/2026</w:t>
       </w:r>
     </w:p>
     <w:p>

</xml_diff>